<commit_message>
Lock procedure letterhead into repeating Word header/footer (fix banner placement)
build_procedure.py placed the letterhead banners in the document BODY, so only
page 1 was branded, continuation pages were bare, and the footer logo floated
wherever the text ended. Moved header banner into the real Word header and the
footer banner + controlled-doc line into the real Word footer, so both repeat on
every page and sit in the margin band (top 1.2"/bottom 1.0", banners 3.3" wide).
Regenerated EXOS-ADM-005-0 with the fix. Locked with a do-not-move-to-body comment.

Co-Authored-By: Claude Opus 4.8 <noreply@anthropic.com>
</commit_message>
<xml_diff>
--- a/process-library/11-administrative/EXOS-ADM-005-0_Business_Travel_and_Company_Card_Procedure.docx
+++ b/process-library/11-administrative/EXOS-ADM-005-0_Business_Travel_and_Company_Card_Procedure.docx
@@ -2,46 +2,6 @@
 <file path=word/document.xml><?xml version="1.0" encoding="utf-8"?>
 <w:document xmlns:wpc="http://schemas.microsoft.com/office/word/2010/wordprocessingCanvas" xmlns:mo="http://schemas.microsoft.com/office/mac/office/2008/main" xmlns:mc="http://schemas.openxmlformats.org/markup-compatibility/2006" xmlns:mv="urn:schemas-microsoft-com:mac:vml" xmlns:o="urn:schemas-microsoft-com:office:office" xmlns:r="http://schemas.openxmlformats.org/officeDocument/2006/relationships" xmlns:m="http://schemas.openxmlformats.org/officeDocument/2006/math" xmlns:v="urn:schemas-microsoft-com:vml" xmlns:wp14="http://schemas.microsoft.com/office/word/2010/wordprocessingDrawing" xmlns:wp="http://schemas.openxmlformats.org/drawingml/2006/wordprocessingDrawing" xmlns:w10="urn:schemas-microsoft-com:office:word" xmlns:w="http://schemas.openxmlformats.org/wordprocessingml/2006/main" xmlns:w14="http://schemas.microsoft.com/office/word/2010/wordml" xmlns:wpg="http://schemas.microsoft.com/office/word/2010/wordprocessingGroup" xmlns:wpi="http://schemas.microsoft.com/office/word/2010/wordprocessingInk" xmlns:wne="http://schemas.microsoft.com/office/word/2006/wordml" xmlns:wps="http://schemas.microsoft.com/office/word/2010/wordprocessingShape" mc:Ignorable="w14 wp14">
   <w:body>
-    <w:p>
-      <w:pPr>
-        <w:spacing w:after="120"/>
-        <w:jc w:val="center"/>
-      </w:pPr>
-      <w:r>
-        <w:drawing>
-          <wp:inline xmlns:a="http://schemas.openxmlformats.org/drawingml/2006/main" xmlns:pic="http://schemas.openxmlformats.org/drawingml/2006/picture">
-            <wp:extent cx="4572000" cy="944009"/>
-            <wp:docPr id="1" name="Picture 1"/>
-            <wp:cNvGraphicFramePr>
-              <a:graphicFrameLocks noChangeAspect="1"/>
-            </wp:cNvGraphicFramePr>
-            <a:graphic>
-              <a:graphicData uri="http://schemas.openxmlformats.org/drawingml/2006/picture">
-                <pic:pic>
-                  <pic:nvPicPr>
-                    <pic:cNvPr id="0" name="exos-letterhead-header.png"/>
-                    <pic:cNvPicPr/>
-                  </pic:nvPicPr>
-                  <pic:blipFill>
-                    <a:blip r:embed="rId9"/>
-                    <a:stretch>
-                      <a:fillRect/>
-                    </a:stretch>
-                  </pic:blipFill>
-                  <pic:spPr>
-                    <a:xfrm>
-                      <a:off x="0" y="0"/>
-                      <a:ext cx="4572000" cy="944009"/>
-                    </a:xfrm>
-                    <a:prstGeom prst="rect"/>
-                  </pic:spPr>
-                </pic:pic>
-              </a:graphicData>
-            </a:graphic>
-          </wp:inline>
-        </w:drawing>
-      </w:r>
-    </w:p>
     <w:p>
       <w:pPr>
         <w:spacing w:after="0" w:before="0"/>
@@ -1179,69 +1139,124 @@
         <w:t>Owner: Operations / Exo   ·   Reference documents: BILL Divvy Card Visa Signature Business — Guide to Benefits; EXOS-ADM-002 Expense Report Submission Procedure; current IRS standard mileage rate</w:t>
       </w:r>
     </w:p>
-    <w:p>
-      <w:pPr>
-        <w:spacing w:before="160" w:after="40"/>
-        <w:jc w:val="center"/>
-      </w:pPr>
-      <w:r>
-        <w:rPr>
-          <w:rFonts w:ascii="Calibri" w:hAnsi="Calibri"/>
-          <w:b w:val="0"/>
-          <w:i w:val="0"/>
-          <w:color w:val="606A78"/>
-          <w:sz w:val="16"/>
-        </w:rPr>
-        <w:t>EXOS-ADM-005-0 Rev 0  ·  Controlled copy — valid for today's date only  ·  Process &amp; Procedure Control per EXOS-US-QMS-001</w:t>
-      </w:r>
-    </w:p>
-    <w:p>
-      <w:pPr>
-        <w:jc w:val="center"/>
-      </w:pPr>
-      <w:r>
-        <w:drawing>
-          <wp:inline xmlns:a="http://schemas.openxmlformats.org/drawingml/2006/main" xmlns:pic="http://schemas.openxmlformats.org/drawingml/2006/picture">
-            <wp:extent cx="4572000" cy="750679"/>
-            <wp:docPr id="2" name="Picture 2"/>
-            <wp:cNvGraphicFramePr>
-              <a:graphicFrameLocks noChangeAspect="1"/>
-            </wp:cNvGraphicFramePr>
-            <a:graphic>
-              <a:graphicData uri="http://schemas.openxmlformats.org/drawingml/2006/picture">
-                <pic:pic>
-                  <pic:nvPicPr>
-                    <pic:cNvPr id="0" name="exos-letterhead-footer.png"/>
-                    <pic:cNvPicPr/>
-                  </pic:nvPicPr>
-                  <pic:blipFill>
-                    <a:blip r:embed="rId10"/>
-                    <a:stretch>
-                      <a:fillRect/>
-                    </a:stretch>
-                  </pic:blipFill>
-                  <pic:spPr>
-                    <a:xfrm>
-                      <a:off x="0" y="0"/>
-                      <a:ext cx="4572000" cy="750679"/>
-                    </a:xfrm>
-                    <a:prstGeom prst="rect"/>
-                  </pic:spPr>
-                </pic:pic>
-              </a:graphicData>
-            </a:graphic>
-          </wp:inline>
-        </w:drawing>
-      </w:r>
-    </w:p>
     <w:sectPr>
+      <w:headerReference w:type="default" r:id="rId9"/>
+      <w:footerReference w:type="default" r:id="rId10"/>
       <w:pgSz w:w="12240" w:h="15840"/>
-      <w:pgMar w:top="864" w:right="1296" w:bottom="864" w:left="1296" w:header="720" w:footer="720" w:gutter="0"/>
+      <w:pgMar w:top="1728" w:right="1296" w:bottom="1440" w:left="1296" w:header="576" w:footer="432" w:gutter="0"/>
       <w:cols w:space="720"/>
       <w:docGrid w:linePitch="360"/>
     </w:sectPr>
   </w:body>
 </w:document>
+</file>
+
+<file path=word/footer1.xml><?xml version="1.0" encoding="utf-8"?>
+<w:ftr xmlns:m="http://schemas.openxmlformats.org/officeDocument/2006/math" xmlns:mc="http://schemas.openxmlformats.org/markup-compatibility/2006" xmlns:mo="http://schemas.microsoft.com/office/mac/office/2008/main" xmlns:mv="urn:schemas-microsoft-com:mac:vml" xmlns:o="urn:schemas-microsoft-com:office:office" xmlns:r="http://schemas.openxmlformats.org/officeDocument/2006/relationships" xmlns:v="urn:schemas-microsoft-com:vml" xmlns:w10="urn:schemas-microsoft-com:office:word" xmlns:w14="http://schemas.microsoft.com/office/word/2010/wordml" xmlns:w="http://schemas.openxmlformats.org/wordprocessingml/2006/main" xmlns:wne="http://schemas.microsoft.com/office/word/2006/wordml" xmlns:wp14="http://schemas.microsoft.com/office/word/2010/wordprocessingDrawing" xmlns:wp="http://schemas.openxmlformats.org/drawingml/2006/wordprocessingDrawing" xmlns:wpc="http://schemas.microsoft.com/office/word/2010/wordprocessingCanvas" xmlns:wpg="http://schemas.microsoft.com/office/word/2010/wordprocessingGroup" xmlns:wpi="http://schemas.microsoft.com/office/word/2010/wordprocessingInk" xmlns:wps="http://schemas.microsoft.com/office/word/2010/wordprocessingShape" mc:Ignorable="w14 wp14">
+  <w:p>
+    <w:pPr>
+      <w:pStyle w:val="Footer"/>
+      <w:spacing w:after="20"/>
+      <w:jc w:val="center"/>
+    </w:pPr>
+    <w:r>
+      <w:drawing>
+        <wp:inline xmlns:a="http://schemas.openxmlformats.org/drawingml/2006/main" xmlns:pic="http://schemas.openxmlformats.org/drawingml/2006/picture">
+          <wp:extent cx="3017520" cy="495448"/>
+          <wp:docPr id="1" name="Picture 1"/>
+          <wp:cNvGraphicFramePr>
+            <a:graphicFrameLocks noChangeAspect="1"/>
+          </wp:cNvGraphicFramePr>
+          <a:graphic>
+            <a:graphicData uri="http://schemas.openxmlformats.org/drawingml/2006/picture">
+              <pic:pic>
+                <pic:nvPicPr>
+                  <pic:cNvPr id="0" name="exos-letterhead-footer.png"/>
+                  <pic:cNvPicPr/>
+                </pic:nvPicPr>
+                <pic:blipFill>
+                  <a:blip r:embed="rId1"/>
+                  <a:stretch>
+                    <a:fillRect/>
+                  </a:stretch>
+                </pic:blipFill>
+                <pic:spPr>
+                  <a:xfrm>
+                    <a:off x="0" y="0"/>
+                    <a:ext cx="3017520" cy="495448"/>
+                  </a:xfrm>
+                  <a:prstGeom prst="rect"/>
+                </pic:spPr>
+              </pic:pic>
+            </a:graphicData>
+          </a:graphic>
+        </wp:inline>
+      </w:drawing>
+    </w:r>
+  </w:p>
+  <w:p>
+    <w:pPr>
+      <w:spacing w:after="0"/>
+      <w:jc w:val="center"/>
+    </w:pPr>
+    <w:r>
+      <w:rPr>
+        <w:rFonts w:ascii="Calibri" w:hAnsi="Calibri"/>
+        <w:b w:val="0"/>
+        <w:i w:val="0"/>
+        <w:color w:val="606A78"/>
+        <w:sz w:val="15"/>
+      </w:rPr>
+      <w:t>EXOS-ADM-005-0 Rev 0  ·  Controlled copy — valid for today's date only  ·  Process &amp; Procedure Control per EXOS-US-QMS-001</w:t>
+    </w:r>
+  </w:p>
+</w:ftr>
+</file>
+
+<file path=word/header1.xml><?xml version="1.0" encoding="utf-8"?>
+<w:hdr xmlns:m="http://schemas.openxmlformats.org/officeDocument/2006/math" xmlns:mc="http://schemas.openxmlformats.org/markup-compatibility/2006" xmlns:mo="http://schemas.microsoft.com/office/mac/office/2008/main" xmlns:mv="urn:schemas-microsoft-com:mac:vml" xmlns:o="urn:schemas-microsoft-com:office:office" xmlns:r="http://schemas.openxmlformats.org/officeDocument/2006/relationships" xmlns:v="urn:schemas-microsoft-com:vml" xmlns:w10="urn:schemas-microsoft-com:office:word" xmlns:w14="http://schemas.microsoft.com/office/word/2010/wordml" xmlns:w="http://schemas.openxmlformats.org/wordprocessingml/2006/main" xmlns:wne="http://schemas.microsoft.com/office/word/2006/wordml" xmlns:wp14="http://schemas.microsoft.com/office/word/2010/wordprocessingDrawing" xmlns:wp="http://schemas.openxmlformats.org/drawingml/2006/wordprocessingDrawing" xmlns:wpc="http://schemas.microsoft.com/office/word/2010/wordprocessingCanvas" xmlns:wpg="http://schemas.microsoft.com/office/word/2010/wordprocessingGroup" xmlns:wpi="http://schemas.microsoft.com/office/word/2010/wordprocessingInk" xmlns:wps="http://schemas.microsoft.com/office/word/2010/wordprocessingShape" mc:Ignorable="w14 wp14">
+  <w:p>
+    <w:pPr>
+      <w:pStyle w:val="Header"/>
+      <w:spacing w:after="0"/>
+      <w:jc w:val="center"/>
+    </w:pPr>
+    <w:r>
+      <w:drawing>
+        <wp:inline xmlns:a="http://schemas.openxmlformats.org/drawingml/2006/main" xmlns:pic="http://schemas.openxmlformats.org/drawingml/2006/picture">
+          <wp:extent cx="3017520" cy="623046"/>
+          <wp:docPr id="1" name="Picture 1"/>
+          <wp:cNvGraphicFramePr>
+            <a:graphicFrameLocks noChangeAspect="1"/>
+          </wp:cNvGraphicFramePr>
+          <a:graphic>
+            <a:graphicData uri="http://schemas.openxmlformats.org/drawingml/2006/picture">
+              <pic:pic>
+                <pic:nvPicPr>
+                  <pic:cNvPr id="0" name="exos-letterhead-header.png"/>
+                  <pic:cNvPicPr/>
+                </pic:nvPicPr>
+                <pic:blipFill>
+                  <a:blip r:embed="rId1"/>
+                  <a:stretch>
+                    <a:fillRect/>
+                  </a:stretch>
+                </pic:blipFill>
+                <pic:spPr>
+                  <a:xfrm>
+                    <a:off x="0" y="0"/>
+                    <a:ext cx="3017520" cy="623046"/>
+                  </a:xfrm>
+                  <a:prstGeom prst="rect"/>
+                </pic:spPr>
+              </pic:pic>
+            </a:graphicData>
+          </a:graphic>
+        </wp:inline>
+      </w:drawing>
+    </w:r>
+  </w:p>
+</w:hdr>
 </file>
 
 <file path=word/numbering.xml><?xml version="1.0" encoding="utf-8"?>

</xml_diff>

<commit_message>
Procedure letterhead: header banner top-left, footer banner bottom-right
Per Jon: align the repeating Word-header banner LEFT and the Word-footer banner
RIGHT (controlled-doc line left). Regenerated EXOS-ADM-005-0.

Co-Authored-By: Claude Opus 4.8 <noreply@anthropic.com>
</commit_message>
<xml_diff>
--- a/process-library/11-administrative/EXOS-ADM-005-0_Business_Travel_and_Company_Card_Procedure.docx
+++ b/process-library/11-administrative/EXOS-ADM-005-0_Business_Travel_and_Company_Card_Procedure.docx
@@ -1157,7 +1157,7 @@
     <w:pPr>
       <w:pStyle w:val="Footer"/>
       <w:spacing w:after="20"/>
-      <w:jc w:val="center"/>
+      <w:jc w:val="right"/>
     </w:pPr>
     <w:r>
       <w:drawing>
@@ -1197,7 +1197,7 @@
   <w:p>
     <w:pPr>
       <w:spacing w:after="0"/>
-      <w:jc w:val="center"/>
+      <w:jc w:val="left"/>
     </w:pPr>
     <w:r>
       <w:rPr>
@@ -1219,7 +1219,7 @@
     <w:pPr>
       <w:pStyle w:val="Header"/>
       <w:spacing w:after="0"/>
-      <w:jc w:val="center"/>
+      <w:jc w:val="left"/>
     </w:pPr>
     <w:r>
       <w:drawing>

</xml_diff>